<commit_message>
feat(hr): break time field, manual endowment form, DEV purge of HR personal data
- Contract 3.1.3 break is now a tag: per-contract start/end, defaults in the
  employer settings (12.30–13.30), RU «с 12.30 до 13.30», KZ case endings by
  the last spoken word («12.30-дан 13.30-ға дейін», «13.00-тен 14.00-ке»).
- Seed writes «Эндаумент фонда» by hand (the rules declined it wrongly).
- scripts/deploy/purge_dev_hr_data.sh clears HR tables and hr/{employees,
  documents,previews} files in a DEV copy (refuses PROD and APP_ENV=production);
  prod_to_dev_sync.sh runs it after the DB/files refresh.

Co-Authored-By: Claude Opus 5.5 <noreply@anthropic.com>
</commit_message>
<xml_diff>
--- a/resources/hr/templates/contract.docx
+++ b/resources/hr/templates/contract.docx
@@ -1586,37 +1586,18 @@
                 <w:rFonts w:ascii="Times New Roman" w:eastAsia="Times New Roman" w:hAnsi="Times New Roman" w:cs="Times New Roman"/>
                 <w:sz w:val="20"/>
                 <w:szCs w:val="20"/>
-                <w:highlight w:val="yellow"/>
-                <w:lang w:val="kk-KZ"/>
-              </w:rPr>
-              <w:t>12.30-дан 13.30</w:t>
-            </w:r>
-            <w:r>
-              <w:rPr>
-                <w:rFonts w:ascii="Times New Roman" w:eastAsia="Times New Roman" w:hAnsi="Times New Roman" w:cs="Times New Roman"/>
-                <w:sz w:val="20"/>
-                <w:szCs w:val="20"/>
-                <w:lang w:val="kk-KZ"/>
-              </w:rPr>
-              <w:t>-</w:t>
-            </w:r>
-            <w:r>
-              <w:rPr>
-                <w:rFonts w:ascii="Times New Roman" w:eastAsia="Times New Roman" w:hAnsi="Times New Roman" w:cs="Times New Roman"/>
-                <w:sz w:val="20"/>
-                <w:szCs w:val="20"/>
-                <w:lang w:val="kk-KZ"/>
-              </w:rPr>
-              <w:t>ға</w:t>
-            </w:r>
-            <w:r>
-              <w:rPr>
-                <w:rFonts w:ascii="Times New Roman" w:eastAsia="Times New Roman" w:hAnsi="Times New Roman" w:cs="Times New Roman"/>
-                <w:sz w:val="20"/>
-                <w:szCs w:val="20"/>
-                <w:lang w:val="kk-KZ"/>
-              </w:rPr>
-              <w:t xml:space="preserve"> дейін.</w:t>
+                <w:lang w:val="kk-KZ"/>
+              </w:rPr>
+              <w:t xml:space="preserve">${break_kz}</w:t>
+            </w:r>
+            <w:r>
+              <w:rPr>
+                <w:rFonts w:ascii="Times New Roman" w:eastAsia="Times New Roman" w:hAnsi="Times New Roman" w:cs="Times New Roman"/>
+                <w:sz w:val="20"/>
+                <w:szCs w:val="20"/>
+                <w:lang w:val="kk-KZ"/>
+              </w:rPr>
+              <w:t xml:space="preserve">.</w:t>
             </w:r>
           </w:p>
           <w:p>
@@ -9624,76 +9605,8 @@
                 <w:rFonts w:ascii="Times New Roman" w:eastAsia="Times New Roman" w:hAnsi="Times New Roman" w:cs="Times New Roman"/>
                 <w:sz w:val="20"/>
                 <w:szCs w:val="20"/>
-                <w:highlight w:val="yellow"/>
-              </w:rPr>
-              <w:t xml:space="preserve">с </w:t>
-            </w:r>
-            <w:r>
-              <w:rPr>
-                <w:rFonts w:ascii="Times New Roman" w:eastAsia="Times New Roman" w:hAnsi="Times New Roman" w:cs="Times New Roman"/>
-                <w:sz w:val="20"/>
-                <w:szCs w:val="20"/>
-                <w:highlight w:val="yellow"/>
-                <w:lang w:val="kk-KZ"/>
-              </w:rPr>
-              <w:t>12</w:t>
-            </w:r>
-            <w:r>
-              <w:rPr>
-                <w:rFonts w:ascii="Times New Roman" w:eastAsia="Times New Roman" w:hAnsi="Times New Roman" w:cs="Times New Roman"/>
-                <w:sz w:val="20"/>
-                <w:szCs w:val="20"/>
-                <w:highlight w:val="yellow"/>
-              </w:rPr>
-              <w:t>.</w:t>
-            </w:r>
-            <w:r>
-              <w:rPr>
-                <w:rFonts w:ascii="Times New Roman" w:eastAsia="Times New Roman" w:hAnsi="Times New Roman" w:cs="Times New Roman"/>
-                <w:sz w:val="20"/>
-                <w:szCs w:val="20"/>
-                <w:highlight w:val="yellow"/>
-                <w:lang w:val="kk-KZ"/>
-              </w:rPr>
-              <w:t>30</w:t>
-            </w:r>
-            <w:r>
-              <w:rPr>
-                <w:rFonts w:ascii="Times New Roman" w:eastAsia="Times New Roman" w:hAnsi="Times New Roman" w:cs="Times New Roman"/>
-                <w:sz w:val="20"/>
-                <w:szCs w:val="20"/>
-                <w:highlight w:val="yellow"/>
-              </w:rPr>
-              <w:t xml:space="preserve"> до </w:t>
-            </w:r>
-            <w:r>
-              <w:rPr>
-                <w:rFonts w:ascii="Times New Roman" w:eastAsia="Times New Roman" w:hAnsi="Times New Roman" w:cs="Times New Roman"/>
-                <w:sz w:val="20"/>
-                <w:szCs w:val="20"/>
-                <w:highlight w:val="yellow"/>
-                <w:lang w:val="kk-KZ"/>
-              </w:rPr>
-              <w:t>13</w:t>
-            </w:r>
-            <w:r>
-              <w:rPr>
-                <w:rFonts w:ascii="Times New Roman" w:eastAsia="Times New Roman" w:hAnsi="Times New Roman" w:cs="Times New Roman"/>
-                <w:sz w:val="20"/>
-                <w:szCs w:val="20"/>
-                <w:highlight w:val="yellow"/>
-              </w:rPr>
-              <w:t>.</w:t>
-            </w:r>
-            <w:r>
-              <w:rPr>
-                <w:rFonts w:ascii="Times New Roman" w:eastAsia="Times New Roman" w:hAnsi="Times New Roman" w:cs="Times New Roman"/>
-                <w:sz w:val="20"/>
-                <w:szCs w:val="20"/>
-                <w:highlight w:val="yellow"/>
-                <w:lang w:val="kk-KZ"/>
-              </w:rPr>
-              <w:t>30</w:t>
+              </w:rPr>
+              <w:t xml:space="preserve">${break_ru}</w:t>
             </w:r>
             <w:r>
               <w:rPr>

</xml_diff>